<commit_message>
Update syllabus schedule and add Canvas-ready HTML version
Schedule table changes:
- Shift all homework assigned/due dates one class session earlier,
  except HW 1 (unchanged).
- Move the Final Project Proposal deadline from Sun Oct 18 to
  Sun Oct 11, so students are further along by the intermediate
  presentations.
- Bold the major project-deliverable and exam deadlines in the
  schedule table.

Also adds html/FIN4414_Syllabus_Fall2026.html, a full HTML rendering
of the syllabus for pasting into the Course Project module on Canvas.
</commit_message>
<xml_diff>
--- a/FIN4414_Syllabus_Fall2026.docx
+++ b/FIN4414_Syllabus_Fall2026.docx
@@ -5640,7 +5640,7 @@
               <w:rPr>
                 <w:sz w:val="16"/>
               </w:rPr>
-              <w:t>HW 1 due</w:t>
+              <w:t>HW 1 due; HW 2 assigned</w:t>
             </w:r>
           </w:p>
         </w:tc>
@@ -5741,12 +5741,6 @@
               <w:spacing w:after="0"/>
               <w:jc w:val="center"/>
             </w:pPr>
-            <w:r>
-              <w:rPr>
-                <w:sz w:val="16"/>
-              </w:rPr>
-              <w:t>HW 2 assigned</w:t>
-            </w:r>
           </w:p>
         </w:tc>
       </w:tr>
@@ -5836,6 +5830,12 @@
               <w:spacing w:after="0"/>
               <w:jc w:val="center"/>
             </w:pPr>
+            <w:r>
+              <w:rPr>
+                <w:sz w:val="16"/>
+              </w:rPr>
+              <w:t>HW 2 due</w:t>
+            </w:r>
           </w:p>
         </w:tc>
       </w:tr>
@@ -5935,12 +5935,6 @@
               <w:spacing w:after="0"/>
               <w:jc w:val="center"/>
             </w:pPr>
-            <w:r>
-              <w:rPr>
-                <w:sz w:val="16"/>
-              </w:rPr>
-              <w:t>HW 2 due</w:t>
-            </w:r>
           </w:p>
         </w:tc>
       </w:tr>
@@ -6030,6 +6024,12 @@
               <w:spacing w:after="0"/>
               <w:jc w:val="center"/>
             </w:pPr>
+            <w:r>
+              <w:rPr>
+                <w:sz w:val="16"/>
+              </w:rPr>
+              <w:t>HW 3 assigned</w:t>
+            </w:r>
           </w:p>
         </w:tc>
       </w:tr>
@@ -6129,12 +6129,6 @@
               <w:spacing w:after="0"/>
               <w:jc w:val="center"/>
             </w:pPr>
-            <w:r>
-              <w:rPr>
-                <w:sz w:val="16"/>
-              </w:rPr>
-              <w:t>HW 3 assigned</w:t>
-            </w:r>
           </w:p>
         </w:tc>
       </w:tr>
@@ -6422,6 +6416,16 @@
               <w:rPr>
                 <w:sz w:val="16"/>
               </w:rPr>
+              <w:t>HW 3 due; HW 4 assigned</w:t>
+            </w:r>
+            <w:r>
+              <w:br/>
+            </w:r>
+            <w:r>
+              <w:rPr>
+                <w:b/>
+                <w:sz w:val="16"/>
+              </w:rPr>
               <w:t>Preliminary proposal due Sun Oct 4</w:t>
             </w:r>
           </w:p>
@@ -6523,12 +6527,6 @@
               <w:spacing w:after="0"/>
               <w:jc w:val="center"/>
             </w:pPr>
-            <w:r>
-              <w:rPr>
-                <w:sz w:val="16"/>
-              </w:rPr>
-              <w:t>HW 3 due; HW 4 assigned</w:t>
-            </w:r>
           </w:p>
         </w:tc>
       </w:tr>
@@ -6619,6 +6617,22 @@
               <w:spacing w:after="0"/>
               <w:jc w:val="center"/>
             </w:pPr>
+            <w:r>
+              <w:rPr>
+                <w:sz w:val="16"/>
+              </w:rPr>
+              <w:t>HW 4 due; HW 5 assigned</w:t>
+            </w:r>
+            <w:r>
+              <w:br/>
+            </w:r>
+            <w:r>
+              <w:rPr>
+                <w:b/>
+                <w:sz w:val="16"/>
+              </w:rPr>
+              <w:t>Final proposal due Sun Oct 11</w:t>
+            </w:r>
           </w:p>
         </w:tc>
       </w:tr>
@@ -6718,12 +6732,6 @@
               <w:spacing w:after="0"/>
               <w:jc w:val="center"/>
             </w:pPr>
-            <w:r>
-              <w:rPr>
-                <w:sz w:val="16"/>
-              </w:rPr>
-              <w:t>HW 4 due; HW 5 assigned</w:t>
-            </w:r>
           </w:p>
         </w:tc>
       </w:tr>
@@ -6817,7 +6825,7 @@
               <w:rPr>
                 <w:sz w:val="16"/>
               </w:rPr>
-              <w:t>Final proposal due Sun Oct 18</w:t>
+              <w:t>HW 5 due; HW 6 assigned</w:t>
             </w:r>
           </w:p>
         </w:tc>
@@ -6918,12 +6926,6 @@
               <w:spacing w:after="0"/>
               <w:jc w:val="center"/>
             </w:pPr>
-            <w:r>
-              <w:rPr>
-                <w:sz w:val="16"/>
-              </w:rPr>
-              <w:t>HW 5 due; HW 6 assigned</w:t>
-            </w:r>
           </w:p>
         </w:tc>
       </w:tr>
@@ -7013,6 +7015,12 @@
               <w:spacing w:after="0"/>
               <w:jc w:val="center"/>
             </w:pPr>
+            <w:r>
+              <w:rPr>
+                <w:sz w:val="16"/>
+              </w:rPr>
+              <w:t>HW 6 due; HW 7 assigned</w:t>
+            </w:r>
           </w:p>
         </w:tc>
       </w:tr>
@@ -7112,12 +7120,6 @@
               <w:spacing w:after="0"/>
               <w:jc w:val="center"/>
             </w:pPr>
-            <w:r>
-              <w:rPr>
-                <w:sz w:val="16"/>
-              </w:rPr>
-              <w:t>HW 6 due; HW 7 assigned</w:t>
-            </w:r>
           </w:p>
         </w:tc>
       </w:tr>
@@ -7207,6 +7209,12 @@
               <w:spacing w:after="0"/>
               <w:jc w:val="center"/>
             </w:pPr>
+            <w:r>
+              <w:rPr>
+                <w:sz w:val="16"/>
+              </w:rPr>
+              <w:t>HW 7 due</w:t>
+            </w:r>
           </w:p>
         </w:tc>
       </w:tr>
@@ -7306,12 +7314,6 @@
               <w:spacing w:after="0"/>
               <w:jc w:val="center"/>
             </w:pPr>
-            <w:r>
-              <w:rPr>
-                <w:sz w:val="16"/>
-              </w:rPr>
-              <w:t>HW 7 due</w:t>
-            </w:r>
           </w:p>
         </w:tc>
       </w:tr>
@@ -7693,6 +7695,7 @@
             </w:pPr>
             <w:r>
               <w:rPr>
+                <w:b/>
                 <w:sz w:val="16"/>
               </w:rPr>
               <w:t>Exam</w:t>
@@ -7788,6 +7791,7 @@
             </w:pPr>
             <w:r>
               <w:rPr>
+                <w:b/>
                 <w:sz w:val="16"/>
               </w:rPr>
               <w:t>Preliminary paper due Sun Nov 22</w:t>
@@ -8165,6 +8169,7 @@
             </w:pPr>
             <w:r>
               <w:rPr>
+                <w:b/>
                 <w:sz w:val="17"/>
               </w:rPr>
               <w:t>Final paper and private replication repository due Sun Dec 13 through Canvas</w:t>

</xml_diff>